<commit_message>
丰智云链(SF-SCM) FP 报告：55项检测名称与客户模板逐项对齐（FRON-002/AUTH-003/BUS-003/BUS-004/VULN-001/VULN-002），重生成 DOCX/PDF
</commit_message>
<xml_diff>
--- a/丰智云链(SF-SCM)_应用安全检测报告_FP.docx
+++ b/丰智云链(SF-SCM)_应用安全检测报告_FP.docx
@@ -1026,7 +1026,7 @@
           </w:tcPr>
           <w:p>
             <w:r>
-              <w:t>前端泄露风险测试（如JS）</w:t>
+              <w:t>前端JS泄露安全测试</w:t>
             </w:r>
           </w:p>
         </w:tc>
@@ -1134,7 +1134,7 @@
           </w:tcPr>
           <w:p>
             <w:r>
-              <w:t>双因素验证功能（短信或邮件等）安全测试</w:t>
+              <w:t>双因素验证功能安全测试</w:t>
             </w:r>
           </w:p>
         </w:tc>
@@ -1674,7 +1674,7 @@
           </w:tcPr>
           <w:p>
             <w:r>
-              <w:t>HTTPS安全测试</w:t>
+              <w:t>HTTPS协议安全测试</w:t>
             </w:r>
           </w:p>
         </w:tc>
@@ -2660,7 +2660,7 @@
         <w:pStyle w:val="Heading3"/>
       </w:pPr>
       <w:r>
-        <w:t>前端泄露风险测试（如JS）</w:t>
+        <w:t>前端JS泄露安全测试</w:t>
       </w:r>
     </w:p>
     <w:tbl>
@@ -2721,7 +2721,7 @@
           </w:tcPr>
           <w:p>
             <w:r>
-              <w:t>前端泄露风险测试（如JS）</w:t>
+              <w:t>前端JS泄露安全测试</w:t>
             </w:r>
           </w:p>
         </w:tc>
@@ -4168,7 +4168,7 @@
         <w:pStyle w:val="Heading3"/>
       </w:pPr>
       <w:r>
-        <w:t>双因素验证功能（短信或邮件等）安全测试</w:t>
+        <w:t>双因素验证功能安全测试</w:t>
       </w:r>
     </w:p>
     <w:tbl>
@@ -4229,7 +4229,7 @@
           </w:tcPr>
           <w:p>
             <w:r>
-              <w:t>双因素验证功能（短信或邮件等）安全测试</w:t>
+              <w:t>双因素验证功能安全测试</w:t>
             </w:r>
           </w:p>
         </w:tc>
@@ -10555,7 +10555,7 @@
         <w:pStyle w:val="Heading3"/>
       </w:pPr>
       <w:r>
-        <w:t>多线程竞争条件安全测试</w:t>
+        <w:t>多线程条件竞争安全测试</w:t>
       </w:r>
     </w:p>
     <w:tbl>
@@ -10616,7 +10616,7 @@
           </w:tcPr>
           <w:p>
             <w:r>
-              <w:t>多线程竞争条件安全测试</w:t>
+              <w:t>多线程条件竞争安全测试</w:t>
             </w:r>
           </w:p>
         </w:tc>
@@ -10838,7 +10838,7 @@
         <w:pStyle w:val="Heading3"/>
       </w:pPr>
       <w:r>
-        <w:t>重要数据类型验证安全测试（如：积分数值、商品数量、userid、供应商id篡改异常值）</w:t>
+        <w:t>重要数据类型验证安全测试</w:t>
       </w:r>
     </w:p>
     <w:tbl>
@@ -10899,7 +10899,7 @@
           </w:tcPr>
           <w:p>
             <w:r>
-              <w:t>重要数据类型验证安全测试（如：积分数值、商品数量、userid、供应商id篡改异常值）</w:t>
+              <w:t>重要数据类型验证安全测试</w:t>
             </w:r>
           </w:p>
         </w:tc>
@@ -13299,7 +13299,7 @@
         <w:pStyle w:val="Heading3"/>
       </w:pPr>
       <w:r>
-        <w:t>HTTPS安全测试</w:t>
+        <w:t>HTTPS协议安全测试</w:t>
       </w:r>
     </w:p>
     <w:tbl>
@@ -13360,7 +13360,7 @@
           </w:tcPr>
           <w:p>
             <w:r>
-              <w:t>HTTPS安全测试</w:t>
+              <w:t>HTTPS协议安全测试</w:t>
             </w:r>
           </w:p>
         </w:tc>
@@ -13608,7 +13608,7 @@
         <w:pStyle w:val="Heading3"/>
       </w:pPr>
       <w:r>
-        <w:t>HTTP高危请求方法安全测试</w:t>
+        <w:t>HTTP请求方法安全测试</w:t>
       </w:r>
     </w:p>
     <w:tbl>
@@ -13669,7 +13669,7 @@
           </w:tcPr>
           <w:p>
             <w:r>
-              <w:t>HTTP高危请求方法安全测试</w:t>
+              <w:t>HTTP请求方法安全测试</w:t>
             </w:r>
           </w:p>
         </w:tc>

</xml_diff>